<commit_message>
Test plans: Positive and Negative test cases, the standard UAT terms
The TEST CASE column and the explanations say Positive / Negative instead
of Happy case / Sad case.

Co-Authored-By: Claude Opus 5.5 <noreply@anthropic.com>
</commit_message>
<xml_diff>
--- a/QA/FETCH-Test-Plan-and-Test-Scripts.docx
+++ b/QA/FETCH-Test-Plan-and-Test-Scripts.docx
@@ -1010,7 +1010,7 @@
                 <w:sz w:val="19"/>
                 <w:szCs w:val="19"/>
               </w:rPr>
-              <w:t xml:space="preserve">Each module on its own. Every input is tried in the five checks (completeness, format, range, consistency, database), each with a happy case followed by its sad cases.</w:t>
+              <w:t xml:space="preserve">Each module on its own. Every input is tried in the five checks (completeness, format, range, consistency, database), each with a positive test case followed by its negative test cases.</w:t>
             </w:r>
           </w:p>
         </w:tc>
@@ -1158,7 +1158,7 @@
                 <w:sz w:val="19"/>
                 <w:szCs w:val="19"/>
               </w:rPr>
-              <w:t xml:space="preserve">A script for each of the three roles, written for the people who will use the system, with a solution for every sad case.</w:t>
+              <w:t xml:space="preserve">A script for each of the three roles, written for the people who will use the system, with a solution for every negative test case.</w:t>
             </w:r>
           </w:p>
         </w:tc>
@@ -1387,7 +1387,7 @@
                 <w:sz w:val="19"/>
                 <w:szCs w:val="19"/>
               </w:rPr>
-              <w:t xml:space="preserve">Happy case</w:t>
+              <w:t xml:space="preserve">Positive test case</w:t>
             </w:r>
           </w:p>
         </w:tc>
@@ -1461,7 +1461,7 @@
                 <w:sz w:val="19"/>
                 <w:szCs w:val="19"/>
               </w:rPr>
-              <w:t xml:space="preserve">Sad case</w:t>
+              <w:t xml:space="preserve">Negative test case</w:t>
             </w:r>
           </w:p>
         </w:tc>
@@ -1569,7 +1569,7 @@
                 <w:sz w:val="19"/>
                 <w:szCs w:val="19"/>
               </w:rPr>
-              <w:t xml:space="preserve">For a sad case, the Problem is the exact message the system shows; the Solution is what the user does to put it right.</w:t>
+              <w:t xml:space="preserve">For a negative test case, the Problem is the exact message the system shows; the Solution is what the user does to put it right.</w:t>
             </w:r>
           </w:p>
         </w:tc>
@@ -3391,7 +3391,7 @@
           <w:sz w:val="21"/>
           <w:szCs w:val="21"/>
         </w:rPr>
-        <w:t xml:space="preserve">Happy and sad cases for every input of every form.</w:t>
+        <w:t xml:space="preserve">Positive and negative test cases for every input of every form.</w:t>
       </w:r>
     </w:p>
     <w:p>
@@ -3568,7 +3568,7 @@
           <w:sz w:val="21"/>
           <w:szCs w:val="21"/>
         </w:rPr>
-        <w:t xml:space="preserve">Each module is tested on its own. Every input is tried against five checks. Each check opens with its happy case and is followed by its sad cases. The description states what the user does; for a sad case the expected result gives the Problem and then the Solution.</w:t>
+        <w:t xml:space="preserve">Each module is tested on its own. Every input is tried against five checks. Each check opens with its positive test case and is followed by its negative test cases. The description states what the user does; for a negative test case the expected result gives the Problem and then the Solution.</w:t>
       </w:r>
     </w:p>
     <w:tbl>
@@ -4305,7 +4305,7 @@
           <w:sz w:val="21"/>
           <w:szCs w:val="21"/>
         </w:rPr>
-        <w:t xml:space="preserve">A user of each role runs that role's script from signing in to logging out, without help from the developers. Each happy case is followed by its sad cases, and every sad case lists the solution, so the tester can confirm that the message is clear enough to act on. A role is accepted when its script has no open defect of severity Critical or High.</w:t>
+        <w:t xml:space="preserve">A user of each role runs that role's script from signing in to logging out, without help from the developers. Each positive test case is followed by its negative test cases, and every negative test case lists the solution, so the tester can confirm that the message is clear enough to act on. A role is accepted when its script has no open defect of severity Critical or High.</w:t>
       </w:r>
     </w:p>
     <w:p>
@@ -9890,7 +9890,7 @@
                 <w:sz w:val="19"/>
                 <w:szCs w:val="19"/>
               </w:rPr>
-              <w:t xml:space="preserve">Every sad case states its solution; the test lead answers questions without doing the steps.</w:t>
+              <w:t xml:space="preserve">Every negative test case states its solution; the test lead answers questions without doing the steps.</w:t>
             </w:r>
           </w:p>
         </w:tc>

</xml_diff>

<commit_message>
Unit plan: Consistency checks test that the data shown is consistent
As the professor described: each menu, tab, filter, chip or card lists
exactly the records that belong there and none that do not, and the same
figure matches on every page (the Dashboard and Inventory/Sales cards come
from the same queries). Negative cases are records that must not appear:
a voided sale in the totals, an expired product among the till's cards,
another supplier's or cashier's records. Rows that test a save moved to
the Database check. 252 cases.

Co-Authored-By: Claude Opus 5.5 <noreply@anthropic.com>
</commit_message>
<xml_diff>
--- a/QA/FETCH-Test-Plan-and-Test-Scripts.docx
+++ b/QA/FETCH-Test-Plan-and-Test-Scripts.docx
@@ -4096,7 +4096,7 @@
                 <w:sz w:val="19"/>
                 <w:szCs w:val="19"/>
               </w:rPr>
-              <w:t xml:space="preserve">Two values must agree, or the screen must show and do what the records say.</w:t>
+              <w:t xml:space="preserve">The data shown is consistent: each menu, filter or card lists exactly the records that belong there and none that do not, and the same figure matches on every page.</w:t>
             </w:r>
           </w:p>
         </w:tc>
@@ -4130,7 +4130,7 @@
                 <w:sz w:val="19"/>
                 <w:szCs w:val="19"/>
               </w:rPr>
-              <w:t xml:space="preserve">New password and confirmation differ; totals</w:t>
+              <w:t xml:space="preserve">Low Stock lists only low-stock products; a voided sale is left out of the totals; Dashboard and Sales show the same revenue</w:t>
             </w:r>
           </w:p>
         </w:tc>
@@ -4204,7 +4204,7 @@
                 <w:sz w:val="19"/>
                 <w:szCs w:val="19"/>
               </w:rPr>
-              <w:t xml:space="preserve">The value is compared with what is already saved.</w:t>
+              <w:t xml:space="preserve">What is saved is stored and read back correctly, and a value is compared with what is already saved.</w:t>
             </w:r>
           </w:p>
         </w:tc>
@@ -4238,7 +4238,7 @@
                 <w:sz w:val="19"/>
                 <w:szCs w:val="19"/>
               </w:rPr>
-              <w:t xml:space="preserve">A SKU or barcode already used; a wrong password</w:t>
+              <w:t xml:space="preserve">An edited price is shown after saving; a SKU or barcode already used; a wrong password</w:t>
             </w:r>
           </w:p>
         </w:tc>

</xml_diff>